<commit_message>
dijital_tema-1-kim11: gorsel alanlarina Shutter onizlemeleri yerlestirildi (2.3 bicimi)
</commit_message>
<xml_diff>
--- a/dijital/dijital_tema-1-kim11.docx
+++ b/dijital/dijital_tema-1-kim11.docx
@@ -116,99 +116,73 @@
         <w:t xml:space="preserve">Fiziksel ve kimyasal değişimlere her zaman bir enerji değişimi eşlik eder. Sistemin çevreye ısı verdiği değişimlere ekzotermik, çevreden ısı aldığı değişimlere ise endotermik değişimler denir. Yanma, donma ve yoğuşma ekzotermik; erime, buharlaşma ve suyun elektrolizi endotermik değişimlere örnektir.</w:t>
       </w:r>
     </w:p>
-    <w:tbl>
-      <w:tblPr>
-        <w:tblW w:w="9000" w:type="dxa"/>
+    <w:p>
+      <w:pPr>
         <w:jc w:val="center"/>
-        <w:tblBorders>
-          <w:top w:val="single" w:sz="8" w:space="0" w:color="7F7F7F"/>
-          <w:left w:val="single" w:sz="8" w:space="0" w:color="7F7F7F"/>
-          <w:bottom w:val="single" w:sz="8" w:space="0" w:color="7F7F7F"/>
-          <w:right w:val="single" w:sz="8" w:space="0" w:color="7F7F7F"/>
-        </w:tblBorders>
-      </w:tblPr>
-      <w:tblGrid>
-        <w:gridCol w:w="9000"/>
-      </w:tblGrid>
-      <w:tr>
-        <w:tc>
-          <w:tcPr>
-            <w:tcW w:w="9000" w:type="dxa"/>
-            <w:shd w:val="clear" w:color="auto" w:fill="EDEDED"/>
-          </w:tcPr>
-          <w:p>
-            <w:pPr>
-              <w:jc w:val="both"/>
-              <w:rPr>
-                <w:rFonts w:ascii="Times New Roman" w:hAnsi="Times New Roman" w:cs="Times New Roman"/>
-                <w:lang w:val="tr-TR"/>
-              </w:rPr>
-            </w:pPr>
-            <w:r>
-              <w:rPr>
-                <w:rFonts w:ascii="Times New Roman" w:hAnsi="Times New Roman" w:cs="Times New Roman"/>
-                <w:lang w:val="tr-TR"/>
-              </w:rPr>
-              <w:t xml:space="preserve">GÖRSEL ALANI (Shutterstock)</w:t>
-            </w:r>
-          </w:p>
-          <w:p>
-            <w:pPr>
-              <w:jc w:val="both"/>
-              <w:rPr>
-                <w:rFonts w:ascii="Times New Roman" w:hAnsi="Times New Roman" w:cs="Times New Roman"/>
-                <w:lang w:val="tr-TR"/>
-              </w:rPr>
-            </w:pPr>
-            <w:r>
-              <w:rPr>
-                <w:rFonts w:ascii="Times New Roman" w:hAnsi="Times New Roman" w:cs="Times New Roman"/>
-                <w:lang w:val="tr-TR"/>
-              </w:rPr>
-              <w:t xml:space="preserve">Tarif: Bir yanda yanan odun/kamp ateşi, diğer yanda eriyen buz küpleri; ekzotermik-endotermik karşılaştırma infografiği (vektörel).</w:t>
-            </w:r>
-          </w:p>
-          <w:p>
-            <w:pPr>
-              <w:jc w:val="both"/>
-              <w:rPr>
-                <w:rFonts w:ascii="Times New Roman" w:hAnsi="Times New Roman" w:cs="Times New Roman"/>
-                <w:lang w:val="tr-TR"/>
-              </w:rPr>
-            </w:pPr>
-            <w:r>
-              <w:rPr>
-                <w:rFonts w:ascii="Times New Roman" w:hAnsi="Times New Roman" w:cs="Times New Roman"/>
-                <w:lang w:val="tr-TR"/>
-              </w:rPr>
-              <w:t xml:space="preserve">Shutter ID: 2389722739 (vektör) — Endothermic and exothermic reactions diagram (burning and melting)</w:t>
-            </w:r>
-          </w:p>
-        </w:tc>
-      </w:tr>
-    </w:tbl>
-    <w:p>
-      <w:pPr>
-        <w:jc w:val="both"/>
-        <w:rPr>
-          <w:rFonts w:ascii="Times New Roman" w:hAnsi="Times New Roman" w:cs="Times New Roman"/>
-          <w:lang w:val="tr-TR"/>
-        </w:rPr>
-      </w:pPr>
+      </w:pPr>
+      <w:r>
+        <w:drawing>
+          <wp:inline xmlns:a="http://schemas.openxmlformats.org/drawingml/2006/main" xmlns:pic="http://schemas.openxmlformats.org/drawingml/2006/picture">
+            <wp:extent cx="3168482" cy="2519999"/>
+            <wp:docPr id="900002" name="Picture 900002"/>
+            <wp:cNvGraphicFramePr>
+              <a:graphicFrameLocks noChangeAspect="1"/>
+            </wp:cNvGraphicFramePr>
+            <a:graphic>
+              <a:graphicData uri="http://schemas.openxmlformats.org/drawingml/2006/picture">
+                <pic:pic>
+                  <pic:nvPicPr>
+                    <pic:cNvPr id="0" name="2389722739_d.jpg"/>
+                    <pic:cNvPicPr/>
+                  </pic:nvPicPr>
+                  <pic:blipFill>
+                    <a:blip r:embed="rId11"/>
+                    <a:stretch>
+                      <a:fillRect/>
+                    </a:stretch>
+                  </pic:blipFill>
+                  <pic:spPr>
+                    <a:xfrm>
+                      <a:off x="0" y="0"/>
+                      <a:ext cx="3168482" cy="2519999"/>
+                    </a:xfrm>
+                    <a:prstGeom prst="rect"/>
+                  </pic:spPr>
+                </pic:pic>
+              </a:graphicData>
+            </a:graphic>
+          </wp:inline>
+        </w:drawing>
+      </w:r>
     </w:p>
     <w:p>
       <w:pPr>
         <w:jc w:val="center"/>
-        <w:rPr>
-          <w:rFonts w:ascii="Times New Roman" w:hAnsi="Times New Roman" w:cs="Times New Roman"/>
-          <w:lang w:val="tr-TR"/>
-        </w:rPr>
       </w:pPr>
       <w:r>
         <w:rPr>
           <w:rFonts w:ascii="Times New Roman" w:hAnsi="Times New Roman" w:cs="Times New Roman"/>
           <w:b/>
           <w:bCs/>
+          <w:highlight w:val="yellow"/>
+          <w:lang w:val="tr-TR"/>
+        </w:rPr>
+        <w:t xml:space="preserve">Shutter id: 2389722739</w:t>
+      </w:r>
+    </w:p>
+    <w:p>
+      <w:pPr>
+        <w:jc w:val="center"/>
+        <w:rPr>
+          <w:rFonts w:ascii="Times New Roman" w:hAnsi="Times New Roman" w:cs="Times New Roman"/>
+          <w:lang w:val="tr-TR"/>
+        </w:rPr>
+      </w:pPr>
+      <w:r>
+        <w:rPr>
+          <w:rFonts w:ascii="Times New Roman" w:hAnsi="Times New Roman" w:cs="Times New Roman"/>
+          <w:b/>
+          <w:bCs/>
           <w:lang w:val="tr-TR"/>
         </w:rPr>
         <w:t xml:space="preserve">Görsel:</w:t>
@@ -253,85 +227,59 @@
         <w:t xml:space="preserve">Kimyasal tepkimelerde bağların kırılması enerji gerektirir, yeni bağların oluşması ise enerji açığa çıkarır. Tepkime entalpisi, kırılan bağların toplam enerjisinden oluşan bağların toplam enerjisi çıkarılarak hesaplanabilir. Standart oluşum entalpileri kullanılarak tepkime entalpisi ise ürünlerin toplam oluşum entalpisinden girenlerin toplam oluşum entalpisi çıkarılarak hesaplanır.</w:t>
       </w:r>
     </w:p>
-    <w:tbl>
-      <w:tblPr>
-        <w:tblW w:w="9000" w:type="dxa"/>
+    <w:p>
+      <w:pPr>
         <w:jc w:val="center"/>
-        <w:tblBorders>
-          <w:top w:val="single" w:sz="8" w:space="0" w:color="7F7F7F"/>
-          <w:left w:val="single" w:sz="8" w:space="0" w:color="7F7F7F"/>
-          <w:bottom w:val="single" w:sz="8" w:space="0" w:color="7F7F7F"/>
-          <w:right w:val="single" w:sz="8" w:space="0" w:color="7F7F7F"/>
-        </w:tblBorders>
-      </w:tblPr>
-      <w:tblGrid>
-        <w:gridCol w:w="9000"/>
-      </w:tblGrid>
-      <w:tr>
-        <w:tc>
-          <w:tcPr>
-            <w:tcW w:w="9000" w:type="dxa"/>
-            <w:shd w:val="clear" w:color="auto" w:fill="EDEDED"/>
-          </w:tcPr>
-          <w:p>
-            <w:pPr>
-              <w:jc w:val="both"/>
-              <w:rPr>
-                <w:rFonts w:ascii="Times New Roman" w:hAnsi="Times New Roman" w:cs="Times New Roman"/>
-                <w:lang w:val="tr-TR"/>
-              </w:rPr>
-            </w:pPr>
-            <w:r>
-              <w:rPr>
-                <w:rFonts w:ascii="Times New Roman" w:hAnsi="Times New Roman" w:cs="Times New Roman"/>
-                <w:lang w:val="tr-TR"/>
-              </w:rPr>
-              <w:t xml:space="preserve">GÖRSEL ALANI (Shutterstock)</w:t>
-            </w:r>
-          </w:p>
-          <w:p>
-            <w:pPr>
-              <w:jc w:val="both"/>
-              <w:rPr>
-                <w:rFonts w:ascii="Times New Roman" w:hAnsi="Times New Roman" w:cs="Times New Roman"/>
-                <w:lang w:val="tr-TR"/>
-              </w:rPr>
-            </w:pPr>
-            <w:r>
-              <w:rPr>
-                <w:rFonts w:ascii="Times New Roman" w:hAnsi="Times New Roman" w:cs="Times New Roman"/>
-                <w:lang w:val="tr-TR"/>
-              </w:rPr>
-              <w:t xml:space="preserve">Tarif: Endotermik ve ekzotermik tepkimeler için yan yana iki potansiyel enerji-tepkime koordinatı grafiği (vektörel).</w:t>
-            </w:r>
-          </w:p>
-          <w:p>
-            <w:pPr>
-              <w:jc w:val="both"/>
-              <w:rPr>
-                <w:rFonts w:ascii="Times New Roman" w:hAnsi="Times New Roman" w:cs="Times New Roman"/>
-                <w:lang w:val="tr-TR"/>
-              </w:rPr>
-            </w:pPr>
-            <w:r>
-              <w:rPr>
-                <w:rFonts w:ascii="Times New Roman" w:hAnsi="Times New Roman" w:cs="Times New Roman"/>
-                <w:lang w:val="tr-TR"/>
-              </w:rPr>
-              <w:t xml:space="preserve">Shutter ID: 2327454223 (vektör) — Enthalpy endothermic versus exothermic reactions</w:t>
-            </w:r>
-          </w:p>
-        </w:tc>
-      </w:tr>
-    </w:tbl>
-    <w:p>
-      <w:pPr>
-        <w:jc w:val="both"/>
-        <w:rPr>
-          <w:rFonts w:ascii="Times New Roman" w:hAnsi="Times New Roman" w:cs="Times New Roman"/>
-          <w:lang w:val="tr-TR"/>
-        </w:rPr>
-      </w:pPr>
+      </w:pPr>
+      <w:r>
+        <w:drawing>
+          <wp:inline xmlns:a="http://schemas.openxmlformats.org/drawingml/2006/main" xmlns:pic="http://schemas.openxmlformats.org/drawingml/2006/picture">
+            <wp:extent cx="4000000" cy="2520000"/>
+            <wp:docPr id="900003" name="Picture 900003"/>
+            <wp:cNvGraphicFramePr>
+              <a:graphicFrameLocks noChangeAspect="1"/>
+            </wp:cNvGraphicFramePr>
+            <a:graphic>
+              <a:graphicData uri="http://schemas.openxmlformats.org/drawingml/2006/picture">
+                <pic:pic>
+                  <pic:nvPicPr>
+                    <pic:cNvPr id="0" name="2327454223_d.jpg"/>
+                    <pic:cNvPicPr/>
+                  </pic:nvPicPr>
+                  <pic:blipFill>
+                    <a:blip r:embed="rId12"/>
+                    <a:stretch>
+                      <a:fillRect/>
+                    </a:stretch>
+                  </pic:blipFill>
+                  <pic:spPr>
+                    <a:xfrm>
+                      <a:off x="0" y="0"/>
+                      <a:ext cx="4000000" cy="2520000"/>
+                    </a:xfrm>
+                    <a:prstGeom prst="rect"/>
+                  </pic:spPr>
+                </pic:pic>
+              </a:graphicData>
+            </a:graphic>
+          </wp:inline>
+        </w:drawing>
+      </w:r>
+    </w:p>
+    <w:p>
+      <w:pPr>
+        <w:jc w:val="center"/>
+      </w:pPr>
+      <w:r>
+        <w:rPr>
+          <w:rFonts w:ascii="Times New Roman" w:hAnsi="Times New Roman" w:cs="Times New Roman"/>
+          <w:b/>
+          <w:bCs/>
+          <w:highlight w:val="yellow"/>
+          <w:lang w:val="tr-TR"/>
+        </w:rPr>
+        <w:t xml:space="preserve">Shutter id: 2327454223</w:t>
+      </w:r>
     </w:p>
     <w:p>
       <w:pPr>

</xml_diff>